<commit_message>
Add publishing DB app (backend, frontend, db objects)
Introduce a Publishing Database UI and API for the coursework: add FastAPI backend (main.py, requirements, .env.example), React + Vite frontend scaffold (index.html, src, vite config, .env.example), and database app objects (views and stored procedures SQL). Update DataBase/docker (compose) and add init script to load app objects; include README with run instructions. Also broaden .gitignore to ignore common Python/Node artifacts and add several CourseWork .docx files.

Add stored procedures and demo scripts

Introduce a set of PL/pgSQL stored procedures for managing customers, editions, authors, typographies and orders (search/get, add with validation, updates, and completion routines). Includes initial DELETE cleanup statements, demo CALL/DO blocks to exercise the procedures, and adds a Word document for Task7.

Update 03_ПМИ_23_о_ИП_3_ТумановДМ_ЛР1_19-04-2026.docx
</commit_message>
<xml_diff>
--- a/DataBase/Semester-6/Task1/03_ПМИ_23_о_ИП_3_ТумановДМ_ЛР1_19-04-2026.docx
+++ b/DataBase/Semester-6/Task1/03_ПМИ_23_о_ИП_3_ТумановДМ_ЛР1_19-04-2026.docx
@@ -2318,14 +2318,12 @@
           <w:lang w:val="en-US"/>
         </w:rPr>
       </w:pPr>
-      <w:proofErr w:type="gramStart"/>
       <w:r>
         <w:rPr>
           <w:lang w:val="en-US"/>
         </w:rPr>
         <w:t>);</w:t>
       </w:r>
-      <w:proofErr w:type="gramEnd"/>
     </w:p>
     <w:p>
       <w:pPr>
@@ -2735,14 +2733,12 @@
           <w:lang w:val="en-US"/>
         </w:rPr>
       </w:pPr>
-      <w:proofErr w:type="gramStart"/>
       <w:r>
         <w:rPr>
           <w:lang w:val="en-US"/>
         </w:rPr>
         <w:t>);</w:t>
       </w:r>
-      <w:proofErr w:type="gramEnd"/>
     </w:p>
     <w:p>
       <w:r>
@@ -3265,14 +3261,12 @@
       </w:r>
     </w:p>
     <w:p>
-      <w:proofErr w:type="gramStart"/>
       <w:r>
         <w:rPr>
           <w:lang w:val="en-US"/>
         </w:rPr>
         <w:t>);</w:t>
       </w:r>
-      <w:proofErr w:type="gramEnd"/>
     </w:p>
     <w:p>
       <w:r>
@@ -3832,14 +3826,12 @@
           <w:lang w:val="en-US"/>
         </w:rPr>
       </w:pPr>
-      <w:proofErr w:type="gramStart"/>
       <w:r>
         <w:rPr>
           <w:lang w:val="en-US"/>
         </w:rPr>
         <w:t>);</w:t>
       </w:r>
-      <w:proofErr w:type="gramEnd"/>
     </w:p>
     <w:p>
       <w:pPr>
@@ -4182,6 +4174,12 @@
           <w:lang w:val="en-US"/>
         </w:rPr>
         <w:t>UNION</w:t>
+      </w:r>
+      <w:r>
+        <w:rPr>
+          <w:lang w:val="en-US"/>
+        </w:rPr>
+        <w:t xml:space="preserve"> </w:t>
       </w:r>
     </w:p>
     <w:p>
@@ -4858,16 +4856,8 @@
         <w:rPr>
           <w:lang w:val="en-US"/>
         </w:rPr>
-        <w:t xml:space="preserve"> IS </w:t>
-      </w:r>
-      <w:proofErr w:type="gramStart"/>
-      <w:r>
-        <w:rPr>
-          <w:lang w:val="en-US"/>
-        </w:rPr>
-        <w:t>NULL;</w:t>
-      </w:r>
-      <w:proofErr w:type="gramEnd"/>
+        <w:t xml:space="preserve"> IS NULL;</w:t>
+      </w:r>
     </w:p>
     <w:p>
       <w:r>
@@ -5099,16 +5089,8 @@
         <w:rPr>
           <w:lang w:val="en-US"/>
         </w:rPr>
-        <w:t xml:space="preserve"> IS </w:t>
-      </w:r>
-      <w:proofErr w:type="gramStart"/>
-      <w:r>
-        <w:rPr>
-          <w:lang w:val="en-US"/>
-        </w:rPr>
-        <w:t>NULL;</w:t>
-      </w:r>
-      <w:proofErr w:type="gramEnd"/>
+        <w:t xml:space="preserve"> IS NULL;</w:t>
+      </w:r>
     </w:p>
     <w:p>
       <w:r>

</xml_diff>